<commit_message>
Summer 2025 Semester Finished
Uploading completed work for summer 2025 BU
</commit_message>
<xml_diff>
--- a/CS699-BU/KevinLopezSepulveda-Dirgha-BU699-FinalProject-Report.docx
+++ b/CS699-BU/KevinLopezSepulveda-Dirgha-BU699-FinalProject-Report.docx
@@ -91,7 +91,7 @@
           <w14:ligatures w14:val="none"/>
         </w:rPr>
         <w:pict w14:anchorId="5A6B5914">
-          <v:rect id="_x0000_i2570" style="width:0;height:1.5pt" o:hralign="center" o:hrstd="t" o:hr="t" fillcolor="#a0a0a0" stroked="f"/>
+          <v:rect id="_x0000_i1025" style="width:0;height:1.5pt" o:hralign="center" o:hrstd="t" o:hr="t" fillcolor="#a0a0a0" stroked="f"/>
         </w:pict>
       </w:r>
     </w:p>
@@ -7868,6 +7868,7 @@
       <w:r>
         <w:rPr>
           <w:rFonts w:ascii="Times New Roman" w:eastAsia="Times New Roman" w:hAnsi="Times New Roman" w:cs="Times New Roman"/>
+          <w:noProof/>
           <w:kern w:val="0"/>
           <w14:ligatures w14:val="none"/>
         </w:rPr>
@@ -8094,7 +8095,7 @@
           <w14:ligatures w14:val="none"/>
         </w:rPr>
         <w:pict w14:anchorId="39179AE6">
-          <v:rect id="_x0000_i2575" style="width:0;height:1.5pt" o:hralign="center" o:hrstd="t" o:hr="t" fillcolor="#a0a0a0" stroked="f"/>
+          <v:rect id="_x0000_i1026" style="width:0;height:1.5pt" o:hralign="center" o:hrstd="t" o:hr="t" fillcolor="#a0a0a0" stroked="f"/>
         </w:pict>
       </w:r>
     </w:p>
@@ -8227,7 +8228,7 @@
           <w14:ligatures w14:val="none"/>
         </w:rPr>
         <w:pict w14:anchorId="599E2978">
-          <v:rect id="_x0000_i2576" style="width:0;height:1.5pt" o:hralign="center" o:hrstd="t" o:hr="t" fillcolor="#a0a0a0" stroked="f"/>
+          <v:rect id="_x0000_i1027" style="width:0;height:1.5pt" o:hralign="center" o:hrstd="t" o:hr="t" fillcolor="#a0a0a0" stroked="f"/>
         </w:pict>
       </w:r>
     </w:p>
@@ -8280,6 +8281,7 @@
         <w:t>U.S. Census Bureau. (2023). American Community Survey. Retrieved from American Community Survey.</w:t>
       </w:r>
     </w:p>
+    <w:p/>
     <w:p/>
     <w:sectPr>
       <w:pgSz w:w="12240" w:h="15840"/>
@@ -11901,6 +11903,7 @@
   <w:style w:type="character" w:default="1" w:styleId="DefaultParagraphFont">
     <w:name w:val="Default Paragraph Font"/>
     <w:uiPriority w:val="1"/>
+    <w:semiHidden/>
     <w:unhideWhenUsed/>
   </w:style>
   <w:style w:type="table" w:default="1" w:styleId="TableNormal">

</xml_diff>